<commit_message>
Add Other Comments to incoming inspections
Inspectors can now add free-text comments one at a time from the incoming
inspection screen, and they render as their own table at the end of the
report -- styled to match the Other Comments table in the incident report.

Stored as a jsonb array on incoming_inspection_details alongside hvac_units
and fire_services, so it round-trips through the review editor without a new
table. Requires migration 0011.

The template's wrapper flag (has_other_comments) and row loop (other_comments)
deliberately use different tag names: sharing one makes docxtemplater pair the
row loop's closing tag with the wrapper's opening tag and fail to compile.

Also reformats the photo caption from "Condition: x | Comments: y" onto two
lines, with the comment line omitted entirely when there is no comment.

Co-Authored-By: Claude Opus 5 <noreply@anthropic.com>
</commit_message>
<xml_diff>
--- a/src/templates/incoming-inspection.docx
+++ b/src/templates/incoming-inspection.docx
@@ -2609,7 +2609,9 @@
                       <w:sz w:val="16"/>
                       <w:szCs w:val="16"/>
                     </w:rPr>
-                    <w:t xml:space="preserve">Condition: {condition} | Comments: {comment}</w:t>
+                    <w:t xml:space="preserve">Condition: {condition}{#comment}</w:t>
+                    <w:br/>
+                    <w:t xml:space="preserve">{comment}{/comment}</w:t>
                   </w:r>
                 </w:p>
               </w:tc>
@@ -2968,7 +2970,9 @@
                       <w:sz w:val="16"/>
                       <w:szCs w:val="16"/>
                     </w:rPr>
-                    <w:t xml:space="preserve">Condition: {condition} | Comments: {comment}</w:t>
+                    <w:t xml:space="preserve">Condition: {condition}{#comment}</w:t>
+                    <w:br/>
+                    <w:t xml:space="preserve">{comment}{/comment}</w:t>
                   </w:r>
                 </w:p>
               </w:tc>
@@ -2988,6 +2992,137 @@
         </w:tc>
       </w:tr>
     </w:tbl>
+    <w:p>
+      <w:pPr>
+        <w:rPr>
+          <w:rFonts w:asciiTheme="majorHAnsi" w:eastAsia="Times New Roman" w:hAnsiTheme="majorHAnsi" w:cstheme="majorHAnsi"/>
+          <w:color w:val="000000"/>
+          <w:sz w:val="16"/>
+          <w:szCs w:val="16"/>
+          <w:lang w:eastAsia="en-AU"/>
+        </w:rPr>
+      </w:pPr>
+      <w:r>
+        <w:rPr>
+          <w:rFonts w:asciiTheme="majorHAnsi" w:eastAsia="Times New Roman" w:hAnsiTheme="majorHAnsi" w:cstheme="majorHAnsi"/>
+          <w:color w:val="000000"/>
+          <w:sz w:val="16"/>
+          <w:szCs w:val="16"/>
+          <w:lang w:eastAsia="en-AU"/>
+        </w:rPr>
+        <w:t>{#has_other_comments}</w:t>
+      </w:r>
+    </w:p>
+    <w:tbl>
+      <w:tblPr>
+        <w:tblW w:w="10450" w:type="dxa"/>
+        <w:tblBorders>
+          <w:top w:val="single" w:sz="4" w:space="0" w:color="A6A6A6" w:themeColor="background1" w:themeShade="A6"/>
+          <w:left w:val="single" w:sz="4" w:space="0" w:color="A6A6A6" w:themeColor="background1" w:themeShade="A6"/>
+          <w:bottom w:val="single" w:sz="4" w:space="0" w:color="A6A6A6" w:themeColor="background1" w:themeShade="A6"/>
+          <w:right w:val="single" w:sz="4" w:space="0" w:color="A6A6A6" w:themeColor="background1" w:themeShade="A6"/>
+          <w:insideH w:val="single" w:sz="4" w:space="0" w:color="A6A6A6" w:themeColor="background1" w:themeShade="A6"/>
+          <w:insideV w:val="single" w:sz="4" w:space="0" w:color="A6A6A6" w:themeColor="background1" w:themeShade="A6"/>
+        </w:tblBorders>
+        <w:tblLayout w:type="fixed"/>
+        <w:tblLook w:val="04A0" w:firstRow="1" w:lastRow="0" w:firstColumn="1" w:lastColumn="0" w:noHBand="0" w:noVBand="1"/>
+      </w:tblPr>
+      <w:tblGrid>
+        <w:gridCol w:w="10450"/>
+      </w:tblGrid>
+      <w:tr>
+        <w:trPr>
+          <w:trHeight w:val="397"/>
+        </w:trPr>
+        <w:tc>
+          <w:tcPr>
+            <w:tcW w:w="10450" w:type="dxa"/>
+            <w:shd w:val="clear" w:color="auto" w:fill="D9D9D9" w:themeFill="background1" w:themeFillShade="D9"/>
+            <w:noWrap/>
+            <w:vAlign w:val="center"/>
+          </w:tcPr>
+          <w:p>
+            <w:pPr>
+              <w:jc w:val="center"/>
+              <w:rPr>
+                <w:rFonts w:asciiTheme="majorHAnsi" w:eastAsia="Times New Roman" w:hAnsiTheme="majorHAnsi" w:cstheme="majorHAnsi"/>
+                <w:b/>
+                <w:bCs/>
+                <w:color w:val="000000"/>
+                <w:sz w:val="16"/>
+                <w:szCs w:val="16"/>
+                <w:lang w:eastAsia="en-AU"/>
+              </w:rPr>
+            </w:pPr>
+            <w:r>
+              <w:rPr>
+                <w:rFonts w:asciiTheme="majorHAnsi" w:eastAsia="Times New Roman" w:hAnsiTheme="majorHAnsi" w:cstheme="majorHAnsi"/>
+                <w:b/>
+                <w:bCs/>
+                <w:color w:val="000000"/>
+                <w:sz w:val="16"/>
+                <w:szCs w:val="16"/>
+                <w:lang w:eastAsia="en-AU"/>
+              </w:rPr>
+              <w:t>Other Comments</w:t>
+            </w:r>
+          </w:p>
+        </w:tc>
+      </w:tr>
+      <w:tr>
+        <w:trPr>
+          <w:trHeight w:val="397"/>
+        </w:trPr>
+        <w:tc>
+          <w:tcPr>
+            <w:tcW w:w="10450" w:type="dxa"/>
+            <w:vAlign w:val="center"/>
+          </w:tcPr>
+          <w:p>
+            <w:pPr>
+              <w:rPr>
+                <w:rFonts w:asciiTheme="majorHAnsi" w:eastAsia="Times New Roman" w:hAnsiTheme="majorHAnsi" w:cstheme="majorHAnsi"/>
+                <w:color w:val="000000"/>
+                <w:sz w:val="16"/>
+                <w:szCs w:val="16"/>
+                <w:lang w:eastAsia="en-AU"/>
+              </w:rPr>
+            </w:pPr>
+            <w:r>
+              <w:rPr>
+                <w:rFonts w:asciiTheme="majorHAnsi" w:eastAsia="Times New Roman" w:hAnsiTheme="majorHAnsi" w:cstheme="majorHAnsi"/>
+                <w:color w:val="000000"/>
+                <w:sz w:val="16"/>
+                <w:szCs w:val="16"/>
+                <w:lang w:eastAsia="en-AU"/>
+              </w:rPr>
+              <w:t>{-w:tr other_comments}{text}{/other_comments}</w:t>
+            </w:r>
+          </w:p>
+        </w:tc>
+      </w:tr>
+    </w:tbl>
+    <w:p>
+      <w:pPr>
+        <w:rPr>
+          <w:rFonts w:asciiTheme="majorHAnsi" w:eastAsia="Times New Roman" w:hAnsiTheme="majorHAnsi" w:cstheme="majorHAnsi"/>
+          <w:color w:val="000000"/>
+          <w:sz w:val="16"/>
+          <w:szCs w:val="16"/>
+          <w:lang w:eastAsia="en-AU"/>
+        </w:rPr>
+      </w:pPr>
+      <w:r>
+        <w:rPr>
+          <w:rFonts w:asciiTheme="majorHAnsi" w:eastAsia="Times New Roman" w:hAnsiTheme="majorHAnsi" w:cstheme="majorHAnsi"/>
+          <w:color w:val="000000"/>
+          <w:sz w:val="16"/>
+          <w:szCs w:val="16"/>
+          <w:lang w:eastAsia="en-AU"/>
+        </w:rPr>
+        <w:t>{/has_other_comments}</w:t>
+      </w:r>
+    </w:p>
     <w:p>
       <w:pPr>
         <w:pStyle w:val="NormalWeb"/>

</xml_diff>

<commit_message>
Hide empty incoming sections, add comment AI suggestions
Empty HVAC and Fire Services sections were rendering as a bare heading with
no rows under it. Both tables are now wrapped in has_* flags, along with the
spacer paragraph that precedes each one so a hidden section doesn't leave a
gap behind.

The Other Comments table was also drawing a right-hand border, unlike every
other table in this template and the incident report it was modelled on --
its cells were missing right="nil".

Reviewers can now polish an Other Comments entry through the same OpenAI
prompt used for action items and notes. The suggestion isn't persisted the way
ai_comment is: comments live in a jsonb array, so writing one back would be a
read-modify-write that could clobber the reviewer's other unsaved edits. It
lands in the textarea instead and is saved as the comment's own text, with a
Revert button restoring what the inspector originally wrote.

Co-Authored-By: Claude Opus 5 <noreply@anthropic.com>
</commit_message>
<xml_diff>
--- a/src/templates/incoming-inspection.docx
+++ b/src/templates/incoming-inspection.docx
@@ -1709,6 +1709,23 @@
           <w:szCs w:val="16"/>
         </w:rPr>
       </w:pPr>
+      <w:r>
+        <w:rPr>
+          <w:rFonts w:asciiTheme="majorHAnsi" w:hAnsiTheme="majorHAnsi" w:cstheme="majorHAnsi"/>
+          <w:sz w:val="16"/>
+          <w:szCs w:val="16"/>
+        </w:rPr>
+        <w:t>{#has_hvac_units}</w:t>
+      </w:r>
+    </w:p>
+    <w:p>
+      <w:pPr>
+        <w:rPr>
+          <w:rFonts w:asciiTheme="majorHAnsi" w:hAnsiTheme="majorHAnsi" w:cstheme="majorHAnsi"/>
+          <w:sz w:val="16"/>
+          <w:szCs w:val="16"/>
+        </w:rPr>
+      </w:pPr>
     </w:p>
     <w:tbl>
       <w:tblPr>
@@ -1984,6 +2001,40 @@
           <w:szCs w:val="16"/>
         </w:rPr>
       </w:pPr>
+      <w:r>
+        <w:rPr>
+          <w:rFonts w:asciiTheme="majorHAnsi" w:hAnsiTheme="majorHAnsi" w:cstheme="majorHAnsi"/>
+          <w:sz w:val="16"/>
+          <w:szCs w:val="16"/>
+        </w:rPr>
+        <w:t>{/has_hvac_units}</w:t>
+      </w:r>
+    </w:p>
+    <w:p>
+      <w:pPr>
+        <w:rPr>
+          <w:rFonts w:asciiTheme="majorHAnsi" w:hAnsiTheme="majorHAnsi" w:cstheme="majorHAnsi"/>
+          <w:sz w:val="16"/>
+          <w:szCs w:val="16"/>
+        </w:rPr>
+      </w:pPr>
+      <w:r>
+        <w:rPr>
+          <w:rFonts w:asciiTheme="majorHAnsi" w:hAnsiTheme="majorHAnsi" w:cstheme="majorHAnsi"/>
+          <w:sz w:val="16"/>
+          <w:szCs w:val="16"/>
+        </w:rPr>
+        <w:t>{#has_fire_services}</w:t>
+      </w:r>
+    </w:p>
+    <w:p>
+      <w:pPr>
+        <w:rPr>
+          <w:rFonts w:asciiTheme="majorHAnsi" w:hAnsiTheme="majorHAnsi" w:cstheme="majorHAnsi"/>
+          <w:sz w:val="16"/>
+          <w:szCs w:val="16"/>
+        </w:rPr>
+      </w:pPr>
     </w:p>
     <w:tbl>
       <w:tblPr>
@@ -2203,6 +2254,23 @@
         </w:tc>
       </w:tr>
     </w:tbl>
+    <w:p>
+      <w:pPr>
+        <w:rPr>
+          <w:rFonts w:asciiTheme="majorHAnsi" w:hAnsiTheme="majorHAnsi" w:cstheme="majorHAnsi"/>
+          <w:sz w:val="16"/>
+          <w:szCs w:val="16"/>
+        </w:rPr>
+      </w:pPr>
+      <w:r>
+        <w:rPr>
+          <w:rFonts w:asciiTheme="majorHAnsi" w:hAnsiTheme="majorHAnsi" w:cstheme="majorHAnsi"/>
+          <w:sz w:val="16"/>
+          <w:szCs w:val="16"/>
+        </w:rPr>
+        <w:t>{/has_fire_services}</w:t>
+      </w:r>
+    </w:p>
     <w:p>
       <w:pPr>
         <w:pStyle w:val="NormalWeb"/>
@@ -3037,6 +3105,9 @@
         <w:tc>
           <w:tcPr>
             <w:tcW w:w="10450" w:type="dxa"/>
+            <w:tcBorders>
+              <w:right w:val="nil"/>
+            </w:tcBorders>
             <w:shd w:val="clear" w:color="auto" w:fill="D9D9D9" w:themeFill="background1" w:themeFillShade="D9"/>
             <w:noWrap/>
             <w:vAlign w:val="center"/>
@@ -3076,6 +3147,9 @@
         <w:tc>
           <w:tcPr>
             <w:tcW w:w="10450" w:type="dxa"/>
+            <w:tcBorders>
+              <w:right w:val="nil"/>
+            </w:tcBorders>
             <w:vAlign w:val="center"/>
           </w:tcPr>
           <w:p>

</xml_diff>